<commit_message>
Registro issue e test: commit della correzione ISS-035
Co-Authored-By: Claude Opus 5.5 <noreply@anthropic.com>
Claude-Session: https://claude.ai/code/session_01E8XCbEeVHWVP3hntUZ6kZ1
</commit_message>
<xml_diff>
--- a/public/documentazione/Registro_Issue_Test_Portale_CWP.docx
+++ b/public/documentazione/Registro_Issue_Test_Portale_CWP.docx
@@ -10169,7 +10169,7 @@
                 <w:sz w:val="18"/>
                 <w:szCs w:val="18"/>
               </w:rPr>
-              <w:t xml:space="preserve">21/10 (</w:t>
+              <w:t xml:space="preserve">21/10 11:43 (</w:t>
             </w:r>
             <w:r>
               <w:rPr>
@@ -10178,7 +10178,7 @@
                 <w:sz w:val="18"/>
                 <w:szCs w:val="18"/>
               </w:rPr>
-              <w:t xml:space="preserve">COMMIT_ISS035</w:t>
+              <w:t xml:space="preserve">e6ed26c</w:t>
             </w:r>
             <w:r>
               <w:rPr>

</xml_diff>

<commit_message>
Registro issue e test: ore corrette
Co-Authored-By: Claude Opus 5.5 <noreply@anthropic.com>
Claude-Session: https://claude.ai/code/session_01E8XCbEeVHWVP3hntUZ6kZ1
</commit_message>
<xml_diff>
--- a/public/documentazione/Registro_Issue_Test_Portale_CWP.docx
+++ b/public/documentazione/Registro_Issue_Test_Portale_CWP.docx
@@ -1315,7 +1315,7 @@
             <w:sz w:val="22"/>
             <w:szCs w:val="22"/>
           </w:rPr>
-          <w:t xml:space="preserve">2.  Riepilogo al 21/10/2026 (ore 11:55)</w:t>
+          <w:t xml:space="preserve">2.  Riepilogo al 21/10/2026 (ore 11:45)</w:t>
         </w:r>
         <w:r>
           <w:rPr>
@@ -2345,7 +2345,7 @@
           <w:sz w:val="34"/>
           <w:szCs w:val="34"/>
         </w:rPr>
-        <w:t xml:space="preserve">2. Riepilogo al 21/10/2026 (ore 11:55)</w:t>
+        <w:t xml:space="preserve">2. Riepilogo al 21/10/2026 (ore 11:45)</w:t>
       </w:r>
       <w:bookmarkEnd w:id="1"/>
     </w:p>
@@ -16302,7 +16302,7 @@
           <w:sz w:val="21"/>
           <w:szCs w:val="21"/>
         </w:rPr>
-        <w:t xml:space="preserve"> 21/10/2026 11:55, 14 serie superate.</w:t>
+        <w:t xml:space="preserve"> 21/10/2026 11:42, 14 serie superate.</w:t>
       </w:r>
     </w:p>
     <w:p>
@@ -17571,7 +17571,7 @@
                 <w:sz w:val="18"/>
                 <w:szCs w:val="18"/>
               </w:rPr>
-              <w:t xml:space="preserve">21/10/2026 11:55</w:t>
+              <w:t xml:space="preserve">21/10/2026 11:45</w:t>
             </w:r>
           </w:p>
         </w:tc>

</xml_diff>

<commit_message>
Registro issue e test: ISS-036 chiuso
Co-Authored-By: Claude Opus 5.5 <noreply@anthropic.com>
Claude-Session: https://claude.ai/code/session_01E8XCbEeVHWVP3hntUZ6kZ1
</commit_message>
<xml_diff>
--- a/public/documentazione/Registro_Issue_Test_Portale_CWP.docx
+++ b/public/documentazione/Registro_Issue_Test_Portale_CWP.docx
@@ -1718,7 +1718,7 @@
             <w:sz w:val="22"/>
             <w:szCs w:val="22"/>
           </w:rPr>
-          <w:t xml:space="preserve">2.  Riepilogo al 21/10/2026 (ore 14:05)</w:t>
+          <w:t xml:space="preserve">2.  Riepilogo al 21/10/2026 (ore 14:15)</w:t>
         </w:r>
         <w:r>
           <w:rPr>
@@ -2748,7 +2748,7 @@
           <w:sz w:val="34"/>
           <w:szCs w:val="34"/>
         </w:rPr>
-        <w:t xml:space="preserve">2. Riepilogo al 21/10/2026 (ore 14:05)</w:t>
+        <w:t xml:space="preserve">2. Riepilogo al 21/10/2026 (ore 14:15)</w:t>
       </w:r>
       <w:bookmarkEnd w:id="1"/>
     </w:p>
@@ -2767,8 +2767,8 @@
       </w:tblPr>
       <w:tblGrid>
         <w:gridCol w:w="2885"/>
-        <w:gridCol w:w="1046"/>
-        <w:gridCol w:w="5707"/>
+        <w:gridCol w:w="1100"/>
+        <w:gridCol w:w="5653"/>
       </w:tblGrid>
       <w:tr>
         <w:trPr>
@@ -2811,7 +2811,7 @@
         </w:tc>
         <w:tc>
           <w:tcPr>
-            <w:tcW w:type="dxa" w:w="1046"/>
+            <w:tcW w:type="dxa" w:w="1100"/>
             <w:tcBorders>
               <w:top w:val="single" w:color="D9D4C5" w:sz="4"/>
               <w:left w:val="single" w:color="D9D4C5" w:sz="4"/>
@@ -2846,7 +2846,7 @@
         </w:tc>
         <w:tc>
           <w:tcPr>
-            <w:tcW w:type="dxa" w:w="5707"/>
+            <w:tcW w:type="dxa" w:w="5653"/>
             <w:tcBorders>
               <w:top w:val="single" w:color="D9D4C5" w:sz="4"/>
               <w:left w:val="single" w:color="D9D4C5" w:sz="4"/>
@@ -2918,65 +2918,65 @@
         </w:tc>
         <w:tc>
           <w:tcPr>
-            <w:tcW w:type="dxa" w:w="1046"/>
-            <w:tcBorders>
-              <w:top w:val="single" w:color="D9D4C5" w:sz="4"/>
-              <w:left w:val="single" w:color="D9D4C5" w:sz="4"/>
-              <w:bottom w:val="single" w:color="D9D4C5" w:sz="4"/>
-              <w:right w:val="single" w:color="D9D4C5" w:sz="4"/>
-            </w:tcBorders>
-            <w:tcMar>
-              <w:top w:type="dxa" w:w="70"/>
-              <w:left w:type="dxa" w:w="110"/>
-              <w:bottom w:type="dxa" w:w="70"/>
-              <w:right w:type="dxa" w:w="110"/>
-            </w:tcMar>
-            <w:vAlign w:val="center"/>
-          </w:tcPr>
-          <w:p>
-            <w:pPr>
-              <w:spacing w:after="0" w:before="0"/>
-            </w:pPr>
-            <w:r>
-              <w:rPr>
-                <w:rFonts w:ascii="Arial" w:cs="Arial" w:eastAsia="Arial" w:hAnsi="Arial"/>
-                <w:color w:val="1B2118"/>
-                <w:sz w:val="18"/>
-                <w:szCs w:val="18"/>
-              </w:rPr>
-              <w:t xml:space="preserve">32</w:t>
-            </w:r>
-          </w:p>
-        </w:tc>
-        <w:tc>
-          <w:tcPr>
-            <w:tcW w:type="dxa" w:w="5707"/>
-            <w:tcBorders>
-              <w:top w:val="single" w:color="D9D4C5" w:sz="4"/>
-              <w:left w:val="single" w:color="D9D4C5" w:sz="4"/>
-              <w:bottom w:val="single" w:color="D9D4C5" w:sz="4"/>
-              <w:right w:val="single" w:color="D9D4C5" w:sz="4"/>
-            </w:tcBorders>
-            <w:tcMar>
-              <w:top w:type="dxa" w:w="70"/>
-              <w:left w:type="dxa" w:w="110"/>
-              <w:bottom w:type="dxa" w:w="70"/>
-              <w:right w:type="dxa" w:w="110"/>
-            </w:tcMar>
-            <w:vAlign w:val="center"/>
-          </w:tcPr>
-          <w:p>
-            <w:pPr>
-              <w:spacing w:after="0" w:before="0"/>
-            </w:pPr>
-            <w:r>
-              <w:rPr>
-                <w:rFonts w:ascii="Arial" w:cs="Arial" w:eastAsia="Arial" w:hAnsi="Arial"/>
-                <w:color w:val="1B2118"/>
-                <w:sz w:val="18"/>
-                <w:szCs w:val="18"/>
-              </w:rPr>
-              <w:t xml:space="preserve">ISS-001 … ISS-034, tranne ISS-012 e ISS-020</w:t>
+            <w:tcW w:type="dxa" w:w="1100"/>
+            <w:tcBorders>
+              <w:top w:val="single" w:color="D9D4C5" w:sz="4"/>
+              <w:left w:val="single" w:color="D9D4C5" w:sz="4"/>
+              <w:bottom w:val="single" w:color="D9D4C5" w:sz="4"/>
+              <w:right w:val="single" w:color="D9D4C5" w:sz="4"/>
+            </w:tcBorders>
+            <w:tcMar>
+              <w:top w:type="dxa" w:w="70"/>
+              <w:left w:type="dxa" w:w="110"/>
+              <w:bottom w:type="dxa" w:w="70"/>
+              <w:right w:type="dxa" w:w="110"/>
+            </w:tcMar>
+            <w:vAlign w:val="center"/>
+          </w:tcPr>
+          <w:p>
+            <w:pPr>
+              <w:spacing w:after="0" w:before="0"/>
+            </w:pPr>
+            <w:r>
+              <w:rPr>
+                <w:rFonts w:ascii="Arial" w:cs="Arial" w:eastAsia="Arial" w:hAnsi="Arial"/>
+                <w:color w:val="1B2118"/>
+                <w:sz w:val="18"/>
+                <w:szCs w:val="18"/>
+              </w:rPr>
+              <w:t xml:space="preserve">33</w:t>
+            </w:r>
+          </w:p>
+        </w:tc>
+        <w:tc>
+          <w:tcPr>
+            <w:tcW w:type="dxa" w:w="5653"/>
+            <w:tcBorders>
+              <w:top w:val="single" w:color="D9D4C5" w:sz="4"/>
+              <w:left w:val="single" w:color="D9D4C5" w:sz="4"/>
+              <w:bottom w:val="single" w:color="D9D4C5" w:sz="4"/>
+              <w:right w:val="single" w:color="D9D4C5" w:sz="4"/>
+            </w:tcBorders>
+            <w:tcMar>
+              <w:top w:type="dxa" w:w="70"/>
+              <w:left w:type="dxa" w:w="110"/>
+              <w:bottom w:type="dxa" w:w="70"/>
+              <w:right w:type="dxa" w:w="110"/>
+            </w:tcMar>
+            <w:vAlign w:val="center"/>
+          </w:tcPr>
+          <w:p>
+            <w:pPr>
+              <w:spacing w:after="0" w:before="0"/>
+            </w:pPr>
+            <w:r>
+              <w:rPr>
+                <w:rFonts w:ascii="Arial" w:cs="Arial" w:eastAsia="Arial" w:hAnsi="Arial"/>
+                <w:color w:val="1B2118"/>
+                <w:sz w:val="18"/>
+                <w:szCs w:val="18"/>
+              </w:rPr>
+              <w:t xml:space="preserve">ISS-001 … ISS-034 tranne ISS-012 e ISS-020; ISS-036</w:t>
             </w:r>
           </w:p>
         </w:tc>
@@ -3020,7 +3020,7 @@
         </w:tc>
         <w:tc>
           <w:tcPr>
-            <w:tcW w:type="dxa" w:w="1046"/>
+            <w:tcW w:type="dxa" w:w="1100"/>
             <w:tcBorders>
               <w:top w:val="single" w:color="D9D4C5" w:sz="4"/>
               <w:left w:val="single" w:color="D9D4C5" w:sz="4"/>
@@ -3047,13 +3047,13 @@
                 <w:sz w:val="18"/>
                 <w:szCs w:val="18"/>
               </w:rPr>
-              <w:t xml:space="preserve">14</w:t>
-            </w:r>
-          </w:p>
-        </w:tc>
-        <w:tc>
-          <w:tcPr>
-            <w:tcW w:type="dxa" w:w="5707"/>
+              <w:t xml:space="preserve">13</w:t>
+            </w:r>
+          </w:p>
+        </w:tc>
+        <w:tc>
+          <w:tcPr>
+            <w:tcW w:type="dxa" w:w="5653"/>
             <w:tcBorders>
               <w:top w:val="single" w:color="D9D4C5" w:sz="4"/>
               <w:left w:val="single" w:color="D9D4C5" w:sz="4"/>
@@ -3080,7 +3080,7 @@
                 <w:sz w:val="18"/>
                 <w:szCs w:val="18"/>
               </w:rPr>
-              <w:t xml:space="preserve">D01, D02, D03, D04, D05, D06, D07, R05, R07, R08, D05-R1, O01, ISS-035, ISS-036</w:t>
+              <w:t xml:space="preserve">D01, D02, D03, D04, D05, D06, D07, R05, R07, R08, D05-R1, O01, ISS-035</w:t>
             </w:r>
           </w:p>
         </w:tc>
@@ -3123,7 +3123,7 @@
         </w:tc>
         <w:tc>
           <w:tcPr>
-            <w:tcW w:type="dxa" w:w="1046"/>
+            <w:tcW w:type="dxa" w:w="1100"/>
             <w:tcBorders>
               <w:top w:val="single" w:color="D9D4C5" w:sz="4"/>
               <w:left w:val="single" w:color="D9D4C5" w:sz="4"/>
@@ -3155,7 +3155,7 @@
         </w:tc>
         <w:tc>
           <w:tcPr>
-            <w:tcW w:type="dxa" w:w="5707"/>
+            <w:tcW w:type="dxa" w:w="5653"/>
             <w:tcBorders>
               <w:top w:val="single" w:color="D9D4C5" w:sz="4"/>
               <w:left w:val="single" w:color="D9D4C5" w:sz="4"/>
@@ -3225,7 +3225,7 @@
         </w:tc>
         <w:tc>
           <w:tcPr>
-            <w:tcW w:type="dxa" w:w="1046"/>
+            <w:tcW w:type="dxa" w:w="1100"/>
             <w:tcBorders>
               <w:top w:val="single" w:color="D9D4C5" w:sz="4"/>
               <w:left w:val="single" w:color="D9D4C5" w:sz="4"/>
@@ -3258,7 +3258,7 @@
         </w:tc>
         <w:tc>
           <w:tcPr>
-            <w:tcW w:type="dxa" w:w="5707"/>
+            <w:tcW w:type="dxa" w:w="5653"/>
             <w:tcBorders>
               <w:top w:val="single" w:color="D9D4C5" w:sz="4"/>
               <w:left w:val="single" w:color="D9D4C5" w:sz="4"/>
@@ -3328,7 +3328,7 @@
         </w:tc>
         <w:tc>
           <w:tcPr>
-            <w:tcW w:type="dxa" w:w="1046"/>
+            <w:tcW w:type="dxa" w:w="1100"/>
             <w:tcBorders>
               <w:top w:val="single" w:color="D9D4C5" w:sz="4"/>
               <w:left w:val="single" w:color="D9D4C5" w:sz="4"/>
@@ -3360,7 +3360,7 @@
         </w:tc>
         <w:tc>
           <w:tcPr>
-            <w:tcW w:type="dxa" w:w="5707"/>
+            <w:tcW w:type="dxa" w:w="5653"/>
             <w:tcBorders>
               <w:top w:val="single" w:color="D9D4C5" w:sz="4"/>
               <w:left w:val="single" w:color="D9D4C5" w:sz="4"/>
@@ -10540,7 +10540,7 @@
                 <w:sz w:val="18"/>
                 <w:szCs w:val="18"/>
               </w:rPr>
-              <w:t xml:space="preserve">CORRETTO_DA_RITESTARE (P2)</w:t>
+              <w:t xml:space="preserve">CHIUSO (P2)</w:t>
             </w:r>
           </w:p>
         </w:tc>
@@ -10662,7 +10662,7 @@
                 <w:sz w:val="18"/>
                 <w:szCs w:val="18"/>
               </w:rPr>
-              <w:t xml:space="preserve">). Da verificare con le prossime ricerche</w:t>
+              <w:t xml:space="preserve">). Verifiche: ricerca delle 12:18 con Bing (76 notizie lette, 41 nuove, 11 attinenti); diagnosi delle 14:12: 12 siti su 14 rispondono (Rinnovabili.it 403 e GreenReport 404 si saltano), Google sempre 503. Progetto Apps Script «Notizie CO2 – Google News» spostato nel cestino di Drive su richiesta di Luca</w:t>
             </w:r>
           </w:p>
         </w:tc>
@@ -18866,6 +18866,77 @@
           </w:p>
         </w:tc>
       </w:tr>
+      <w:tr>
+        <w:trPr>
+          <w:cantSplit/>
+        </w:trPr>
+        <w:tc>
+          <w:tcPr>
+            <w:tcW w:type="dxa" w:w="2029"/>
+            <w:tcBorders>
+              <w:top w:val="single" w:color="D9D4C5" w:sz="4"/>
+              <w:left w:val="single" w:color="D9D4C5" w:sz="4"/>
+              <w:bottom w:val="single" w:color="D9D4C5" w:sz="4"/>
+              <w:right w:val="single" w:color="D9D4C5" w:sz="4"/>
+            </w:tcBorders>
+            <w:shd w:fill="F6F4EE" w:color="auto" w:val="clear"/>
+            <w:tcMar>
+              <w:top w:type="dxa" w:w="70"/>
+              <w:left w:type="dxa" w:w="110"/>
+              <w:bottom w:type="dxa" w:w="70"/>
+              <w:right w:type="dxa" w:w="110"/>
+            </w:tcMar>
+            <w:vAlign w:val="center"/>
+          </w:tcPr>
+          <w:p>
+            <w:pPr>
+              <w:spacing w:after="0" w:before="0"/>
+            </w:pPr>
+            <w:r>
+              <w:rPr>
+                <w:rFonts w:ascii="Arial" w:cs="Arial" w:eastAsia="Arial" w:hAnsi="Arial"/>
+                <w:color w:val="1B2118"/>
+                <w:sz w:val="18"/>
+                <w:szCs w:val="18"/>
+              </w:rPr>
+              <w:t xml:space="preserve">21/10/2026 14:15</w:t>
+            </w:r>
+          </w:p>
+        </w:tc>
+        <w:tc>
+          <w:tcPr>
+            <w:tcW w:type="dxa" w:w="7609"/>
+            <w:tcBorders>
+              <w:top w:val="single" w:color="D9D4C5" w:sz="4"/>
+              <w:left w:val="single" w:color="D9D4C5" w:sz="4"/>
+              <w:bottom w:val="single" w:color="D9D4C5" w:sz="4"/>
+              <w:right w:val="single" w:color="D9D4C5" w:sz="4"/>
+            </w:tcBorders>
+            <w:shd w:fill="F6F4EE" w:color="auto" w:val="clear"/>
+            <w:tcMar>
+              <w:top w:type="dxa" w:w="70"/>
+              <w:left w:type="dxa" w:w="110"/>
+              <w:bottom w:type="dxa" w:w="70"/>
+              <w:right w:type="dxa" w:w="110"/>
+            </w:tcMar>
+            <w:vAlign w:val="center"/>
+          </w:tcPr>
+          <w:p>
+            <w:pPr>
+              <w:spacing w:after="0" w:before="0"/>
+            </w:pPr>
+            <w:r>
+              <w:rPr>
+                <w:rFonts w:ascii="Arial" w:cs="Arial" w:eastAsia="Arial" w:hAnsi="Arial"/>
+                <w:color w:val="1B2118"/>
+                <w:sz w:val="18"/>
+                <w:szCs w:val="18"/>
+              </w:rPr>
+              <w:t xml:space="preserve">ISS-036 chiuso: Bing e 12 siti verificati</w:t>
+            </w:r>
+          </w:p>
+        </w:tc>
+      </w:tr>
     </w:tbl>
     <w:p>
       <w:pPr>

</xml_diff>

<commit_message>
Documenti: rilascio in produzione dei rilievi N01-N06, script 38-39 e navigazione da smartphone
Co-Authored-By: Claude Opus 5.5 <noreply@anthropic.com>
Claude-Session: https://claude.ai/code/session_01E8XCbEeVHWVP3hntUZ6kZ1
</commit_message>
<xml_diff>
--- a/public/documentazione/Registro_Issue_Test_Portale_CWP.docx
+++ b/public/documentazione/Registro_Issue_Test_Portale_CWP.docx
@@ -302,7 +302,7 @@
                 <w:sz w:val="20"/>
                 <w:szCs w:val="20"/>
               </w:rPr>
-              <w:t xml:space="preserve">Rev. 1.9</w:t>
+              <w:t xml:space="preserve">Rev. 1.10</w:t>
             </w:r>
           </w:p>
         </w:tc>
@@ -719,7 +719,7 @@
                 <w:sz w:val="18"/>
                 <w:szCs w:val="18"/>
               </w:rPr>
-              <w:t xml:space="preserve">1.9</w:t>
+              <w:t xml:space="preserve">1.10</w:t>
             </w:r>
           </w:p>
         </w:tc>
@@ -783,7 +783,7 @@
                 <w:sz w:val="18"/>
                 <w:szCs w:val="18"/>
               </w:rPr>
-              <w:t xml:space="preserve">ISS-038: navigazione da smartphone.</w:t>
+              <w:t xml:space="preserve">N01-N04 e ISS-038 in produzione.</w:t>
             </w:r>
           </w:p>
         </w:tc>
@@ -853,7 +853,7 @@
                 <w:sz w:val="18"/>
                 <w:szCs w:val="18"/>
               </w:rPr>
-              <w:t xml:space="preserve">1.8</w:t>
+              <w:t xml:space="preserve">1.9</w:t>
             </w:r>
           </w:p>
         </w:tc>
@@ -919,7 +919,7 @@
                 <w:sz w:val="18"/>
                 <w:szCs w:val="18"/>
               </w:rPr>
-              <w:t xml:space="preserve">Rilievi N01-N06 della terza sessione: N01-N04 corretti da ritestare, N05 e N06 in attesa di regola; prove rilievi_n.test.mjs e t39.sql.</w:t>
+              <w:t xml:space="preserve">ISS-038: navigazione da smartphone.</w:t>
             </w:r>
           </w:p>
         </w:tc>
@@ -989,7 +989,7 @@
                 <w:sz w:val="18"/>
                 <w:szCs w:val="18"/>
               </w:rPr>
-              <w:t xml:space="preserve">1.7</w:t>
+              <w:t xml:space="preserve">1.8</w:t>
             </w:r>
           </w:p>
         </w:tc>
@@ -1021,7 +1021,7 @@
                 <w:sz w:val="18"/>
                 <w:szCs w:val="18"/>
               </w:rPr>
-              <w:t xml:space="preserve">21/10/2026</w:t>
+              <w:t xml:space="preserve">22/10/2026</w:t>
             </w:r>
           </w:p>
         </w:tc>
@@ -1053,7 +1053,7 @@
                 <w:sz w:val="18"/>
                 <w:szCs w:val="18"/>
               </w:rPr>
-              <w:t xml:space="preserve">ISS-037: backup dal Mac.</w:t>
+              <w:t xml:space="preserve">Rilievi N01-N06 della terza sessione: N01-N04 corretti da ritestare, N05 e N06 in attesa di regola; prove rilievi_n.test.mjs e t39.sql.</w:t>
             </w:r>
           </w:p>
         </w:tc>
@@ -1123,7 +1123,7 @@
                 <w:sz w:val="18"/>
                 <w:szCs w:val="18"/>
               </w:rPr>
-              <w:t xml:space="preserve">1.6</w:t>
+              <w:t xml:space="preserve">1.7</w:t>
             </w:r>
           </w:p>
         </w:tc>
@@ -1189,7 +1189,7 @@
                 <w:sz w:val="18"/>
                 <w:szCs w:val="18"/>
               </w:rPr>
-              <w:t xml:space="preserve">ISS-036: causa e tramite per Google News. Prova t37.sql. ISS-036: tramite bloccato da Google, siti ambientali. ISS-036: tramite bloccato da Google, siti ambientali.</w:t>
+              <w:t xml:space="preserve">ISS-037: backup dal Mac.</w:t>
             </w:r>
           </w:p>
         </w:tc>
@@ -1259,7 +1259,7 @@
                 <w:sz w:val="18"/>
                 <w:szCs w:val="18"/>
               </w:rPr>
-              <w:t xml:space="preserve">1.5</w:t>
+              <w:t xml:space="preserve">1.6</w:t>
             </w:r>
           </w:p>
         </w:tc>
@@ -1323,7 +1323,7 @@
                 <w:sz w:val="18"/>
                 <w:szCs w:val="18"/>
               </w:rPr>
-              <w:t xml:space="preserve">ISS-036: canali News da Google a Bing.</w:t>
+              <w:t xml:space="preserve">ISS-036: causa e tramite per Google News. Prova t37.sql. ISS-036: tramite bloccato da Google, siti ambientali. ISS-036: tramite bloccato da Google, siti ambientali.</w:t>
             </w:r>
           </w:p>
         </w:tc>
@@ -1393,7 +1393,7 @@
                 <w:sz w:val="18"/>
                 <w:szCs w:val="18"/>
               </w:rPr>
-              <w:t xml:space="preserve">1.4</w:t>
+              <w:t xml:space="preserve">1.5</w:t>
             </w:r>
           </w:p>
         </w:tc>
@@ -1459,7 +1459,7 @@
                 <w:sz w:val="18"/>
                 <w:szCs w:val="18"/>
               </w:rPr>
-              <w:t xml:space="preserve">Nuove prove notizie.test.mjs e t36.sql.</w:t>
+              <w:t xml:space="preserve">ISS-036: canali News da Google a Bing.</w:t>
             </w:r>
           </w:p>
         </w:tc>
@@ -1529,7 +1529,7 @@
                 <w:sz w:val="18"/>
                 <w:szCs w:val="18"/>
               </w:rPr>
-              <w:t xml:space="preserve">1.3</w:t>
+              <w:t xml:space="preserve">1.4</w:t>
             </w:r>
           </w:p>
         </w:tc>
@@ -1593,7 +1593,7 @@
                 <w:sz w:val="18"/>
                 <w:szCs w:val="18"/>
               </w:rPr>
-              <w:t xml:space="preserve">ISS-035: PDF ed Excel della simulazione con tutti i dati e i grafici.</w:t>
+              <w:t xml:space="preserve">Nuove prove notizie.test.mjs e t36.sql.</w:t>
             </w:r>
           </w:p>
         </w:tc>
@@ -1663,7 +1663,7 @@
                 <w:sz w:val="18"/>
                 <w:szCs w:val="18"/>
               </w:rPr>
-              <w:t xml:space="preserve">1.2</w:t>
+              <w:t xml:space="preserve">1.3</w:t>
             </w:r>
           </w:p>
         </w:tc>
@@ -1729,7 +1729,7 @@
                 <w:sz w:val="18"/>
                 <w:szCs w:val="18"/>
               </w:rPr>
-              <w:t xml:space="preserve">Nuova serie di prove dell'assistente.</w:t>
+              <w:t xml:space="preserve">ISS-035: PDF ed Excel della simulazione con tutti i dati e i grafici.</w:t>
             </w:r>
           </w:p>
         </w:tc>
@@ -1799,7 +1799,7 @@
                 <w:sz w:val="18"/>
                 <w:szCs w:val="18"/>
               </w:rPr>
-              <w:t xml:space="preserve">1.1</w:t>
+              <w:t xml:space="preserve">1.2</w:t>
             </w:r>
           </w:p>
         </w:tc>
@@ -1863,7 +1863,7 @@
                 <w:sz w:val="18"/>
                 <w:szCs w:val="18"/>
               </w:rPr>
-              <w:t xml:space="preserve">R08 corretto e da ritestare; prova di ripristino da backup.</w:t>
+              <w:t xml:space="preserve">Nuova serie di prove dell'assistente.</w:t>
             </w:r>
           </w:p>
         </w:tc>
@@ -1933,6 +1933,142 @@
                 <w:sz w:val="18"/>
                 <w:szCs w:val="18"/>
               </w:rPr>
+              <w:t xml:space="preserve">1.1</w:t>
+            </w:r>
+          </w:p>
+        </w:tc>
+        <w:tc>
+          <w:tcPr>
+            <w:tcW w:type="dxa" w:w="1300"/>
+            <w:tcBorders>
+              <w:top w:val="single" w:color="D9D4C5" w:sz="4"/>
+              <w:left w:val="single" w:color="D9D4C5" w:sz="4"/>
+              <w:bottom w:val="single" w:color="D9D4C5" w:sz="4"/>
+              <w:right w:val="single" w:color="D9D4C5" w:sz="4"/>
+            </w:tcBorders>
+            <w:shd w:fill="F6F4EE" w:color="auto" w:val="clear"/>
+            <w:tcMar>
+              <w:top w:type="dxa" w:w="70"/>
+              <w:left w:type="dxa" w:w="110"/>
+              <w:bottom w:type="dxa" w:w="70"/>
+              <w:right w:type="dxa" w:w="110"/>
+            </w:tcMar>
+            <w:vAlign w:val="center"/>
+          </w:tcPr>
+          <w:p>
+            <w:pPr>
+              <w:spacing w:after="0" w:before="0"/>
+            </w:pPr>
+            <w:r>
+              <w:rPr>
+                <w:rFonts w:ascii="Arial" w:cs="Arial" w:eastAsia="Arial" w:hAnsi="Arial"/>
+                <w:color w:val="1B2118"/>
+                <w:sz w:val="18"/>
+                <w:szCs w:val="18"/>
+              </w:rPr>
+              <w:t xml:space="preserve">21/10/2026</w:t>
+            </w:r>
+          </w:p>
+        </w:tc>
+        <w:tc>
+          <w:tcPr>
+            <w:tcW w:type="dxa" w:w="5538"/>
+            <w:tcBorders>
+              <w:top w:val="single" w:color="D9D4C5" w:sz="4"/>
+              <w:left w:val="single" w:color="D9D4C5" w:sz="4"/>
+              <w:bottom w:val="single" w:color="D9D4C5" w:sz="4"/>
+              <w:right w:val="single" w:color="D9D4C5" w:sz="4"/>
+            </w:tcBorders>
+            <w:shd w:fill="F6F4EE" w:color="auto" w:val="clear"/>
+            <w:tcMar>
+              <w:top w:type="dxa" w:w="70"/>
+              <w:left w:type="dxa" w:w="110"/>
+              <w:bottom w:type="dxa" w:w="70"/>
+              <w:right w:type="dxa" w:w="110"/>
+            </w:tcMar>
+            <w:vAlign w:val="center"/>
+          </w:tcPr>
+          <w:p>
+            <w:pPr>
+              <w:spacing w:after="0" w:before="0"/>
+            </w:pPr>
+            <w:r>
+              <w:rPr>
+                <w:rFonts w:ascii="Arial" w:cs="Arial" w:eastAsia="Arial" w:hAnsi="Arial"/>
+                <w:color w:val="1B2118"/>
+                <w:sz w:val="18"/>
+                <w:szCs w:val="18"/>
+              </w:rPr>
+              <w:t xml:space="preserve">R08 corretto e da ritestare; prova di ripristino da backup.</w:t>
+            </w:r>
+          </w:p>
+        </w:tc>
+        <w:tc>
+          <w:tcPr>
+            <w:tcW w:type="dxa" w:w="2000"/>
+            <w:tcBorders>
+              <w:top w:val="single" w:color="D9D4C5" w:sz="4"/>
+              <w:left w:val="single" w:color="D9D4C5" w:sz="4"/>
+              <w:bottom w:val="single" w:color="D9D4C5" w:sz="4"/>
+              <w:right w:val="single" w:color="D9D4C5" w:sz="4"/>
+            </w:tcBorders>
+            <w:shd w:fill="F6F4EE" w:color="auto" w:val="clear"/>
+            <w:tcMar>
+              <w:top w:type="dxa" w:w="70"/>
+              <w:left w:type="dxa" w:w="110"/>
+              <w:bottom w:type="dxa" w:w="70"/>
+              <w:right w:type="dxa" w:w="110"/>
+            </w:tcMar>
+            <w:vAlign w:val="center"/>
+          </w:tcPr>
+          <w:p>
+            <w:pPr>
+              <w:spacing w:after="0" w:before="0"/>
+            </w:pPr>
+            <w:r>
+              <w:rPr>
+                <w:rFonts w:ascii="Arial" w:cs="Arial" w:eastAsia="Arial" w:hAnsi="Arial"/>
+                <w:color w:val="1B2118"/>
+                <w:sz w:val="18"/>
+                <w:szCs w:val="18"/>
+              </w:rPr>
+              <w:t xml:space="preserve">Fondazione Operate</w:t>
+            </w:r>
+          </w:p>
+        </w:tc>
+      </w:tr>
+      <w:tr>
+        <w:trPr>
+          <w:cantSplit/>
+        </w:trPr>
+        <w:tc>
+          <w:tcPr>
+            <w:tcW w:type="dxa" w:w="800"/>
+            <w:tcBorders>
+              <w:top w:val="single" w:color="D9D4C5" w:sz="4"/>
+              <w:left w:val="single" w:color="D9D4C5" w:sz="4"/>
+              <w:bottom w:val="single" w:color="D9D4C5" w:sz="4"/>
+              <w:right w:val="single" w:color="D9D4C5" w:sz="4"/>
+            </w:tcBorders>
+            <w:tcMar>
+              <w:top w:type="dxa" w:w="70"/>
+              <w:left w:type="dxa" w:w="110"/>
+              <w:bottom w:type="dxa" w:w="70"/>
+              <w:right w:type="dxa" w:w="110"/>
+            </w:tcMar>
+            <w:vAlign w:val="center"/>
+          </w:tcPr>
+          <w:p>
+            <w:pPr>
+              <w:spacing w:after="0" w:before="0"/>
+            </w:pPr>
+            <w:r>
+              <w:rPr>
+                <w:rFonts w:ascii="Arial" w:cs="Arial" w:eastAsia="Arial" w:hAnsi="Arial"/>
+                <w:color w:val="1B2118"/>
+                <w:sz w:val="18"/>
+                <w:szCs w:val="18"/>
+              </w:rPr>
               <w:t xml:space="preserve">1.0</w:t>
             </w:r>
           </w:p>
@@ -1946,7 +2082,6 @@
               <w:bottom w:val="single" w:color="D9D4C5" w:sz="4"/>
               <w:right w:val="single" w:color="D9D4C5" w:sz="4"/>
             </w:tcBorders>
-            <w:shd w:fill="F6F4EE" w:color="auto" w:val="clear"/>
             <w:tcMar>
               <w:top w:type="dxa" w:w="70"/>
               <w:left w:type="dxa" w:w="110"/>
@@ -1979,7 +2114,6 @@
               <w:bottom w:val="single" w:color="D9D4C5" w:sz="4"/>
               <w:right w:val="single" w:color="D9D4C5" w:sz="4"/>
             </w:tcBorders>
-            <w:shd w:fill="F6F4EE" w:color="auto" w:val="clear"/>
             <w:tcMar>
               <w:top w:type="dxa" w:w="70"/>
               <w:left w:type="dxa" w:w="110"/>
@@ -2012,7 +2146,6 @@
               <w:bottom w:val="single" w:color="D9D4C5" w:sz="4"/>
               <w:right w:val="single" w:color="D9D4C5" w:sz="4"/>
             </w:tcBorders>
-            <w:shd w:fill="F6F4EE" w:color="auto" w:val="clear"/>
             <w:tcMar>
               <w:top w:type="dxa" w:w="70"/>
               <w:left w:type="dxa" w:w="110"/>
@@ -2054,7 +2187,7 @@
           <w:sz w:val="20"/>
           <w:szCs w:val="20"/>
         </w:rPr>
-        <w:t xml:space="preserve">Fotografia del registro alla revisione 1.9 del 22/10/2026. Il registro si aggiorna a ogni variazione (segnalazione, correzione, ritest, rilascio); la versione corrente si scarica dall'area Documentazione del portale (solo Amministratori).</w:t>
+        <w:t xml:space="preserve">Fotografia del registro alla revisione 1.10 del 22/10/2026. Il registro si aggiorna a ogni variazione (segnalazione, correzione, ritest, rilascio); la versione corrente si scarica dall'area Documentazione del portale (solo Amministratori).</w:t>
       </w:r>
     </w:p>
     <w:p>
@@ -3487,25 +3620,7 @@
                 <w:sz w:val="18"/>
                 <w:szCs w:val="18"/>
               </w:rPr>
-              <w:t xml:space="preserve">D01, D02, D03, D04, D05, D06, D07, R05, R07, R08, D05-R1, O01, ISS-035, ISS-037, ISS-038, N01, N02, N03, N04 (N01-N04 sul ramo </w:t>
-            </w:r>
-            <w:r>
-              <w:rPr>
-                <w:rFonts w:ascii="Consolas" w:cs="Consolas" w:eastAsia="Consolas" w:hAnsi="Consolas"/>
-                <w:color w:val="2F5D3A"/>
-                <w:sz w:val="18"/>
-                <w:szCs w:val="18"/>
-              </w:rPr>
-              <w:t xml:space="preserve">correzioni-rilievi-n01-n06</w:t>
-            </w:r>
-            <w:r>
-              <w:rPr>
-                <w:rFonts w:ascii="Arial" w:cs="Arial" w:eastAsia="Arial" w:hAnsi="Arial"/>
-                <w:color w:val="1B2118"/>
-                <w:sz w:val="18"/>
-                <w:szCs w:val="18"/>
-              </w:rPr>
-              <w:t xml:space="preserve">, non ancora in produzione; ciascuno con una domanda residua alla Fondazione)</w:t>
+              <w:t xml:space="preserve">D01, D02, D03, D04, D05, D06, D07, R05, R07, R08, D05-R1, O01, ISS-035, ISS-037, ISS-038, N01, N02, N03, N04 (N01-N04 e ISS-038 in produzione dal 22/10 alle 14:30; N01-N04 con una domanda residua alla Fondazione)</w:t>
             </w:r>
           </w:p>
         </w:tc>
@@ -15302,25 +15417,7 @@
                 <w:sz w:val="18"/>
                 <w:szCs w:val="18"/>
               </w:rPr>
-              <w:t xml:space="preserve">22/10 (ramo </w:t>
-            </w:r>
-            <w:r>
-              <w:rPr>
-                <w:rFonts w:ascii="Consolas" w:cs="Consolas" w:eastAsia="Consolas" w:hAnsi="Consolas"/>
-                <w:color w:val="2F5D3A"/>
-                <w:sz w:val="18"/>
-                <w:szCs w:val="18"/>
-              </w:rPr>
-              <w:t xml:space="preserve">ottimizzazione-smartphone</w:t>
-            </w:r>
-            <w:r>
-              <w:rPr>
-                <w:rFonts w:ascii="Arial" w:cs="Arial" w:eastAsia="Arial" w:hAnsi="Arial"/>
-                <w:color w:val="1B2118"/>
-                <w:sz w:val="18"/>
-                <w:szCs w:val="18"/>
-              </w:rPr>
-              <w:t xml:space="preserve">): menu a pannello, schede al posto delle tabelle in Dashboard e Audit, elenco e dettaglio delle pratiche uno alla volta, campi a 16 px; prove 10.10g-10.10l</w:t>
+              <w:t xml:space="preserve">22/10, in produzione alle 14:30: menu a pannello, schede al posto delle tabelle in Dashboard e Audit, elenco e dettaglio delle pratiche uno alla volta, campi a 16 px; prove 10.10g-10.10l</w:t>
             </w:r>
           </w:p>
         </w:tc>
@@ -15519,7 +15616,7 @@
                 <w:sz w:val="18"/>
                 <w:szCs w:val="18"/>
               </w:rPr>
-              <w:t xml:space="preserve">, ramo): rate annuali di un corrispettivo unico (contratti di consulenza e partecipazione); etichette e nota in pagina, PDF ed Excel; durate diverse da 10 anni segnalate come stima</w:t>
+              <w:t xml:space="preserve">; in produzione il 22/10): rate annuali di un corrispettivo unico (contratti di consulenza e partecipazione); etichette e nota in pagina, PDF ed Excel; durate diverse da 10 anni segnalate come stima</w:t>
             </w:r>
           </w:p>
         </w:tc>
@@ -15713,7 +15810,7 @@
                 <w:sz w:val="18"/>
                 <w:szCs w:val="18"/>
               </w:rPr>
-              <w:t xml:space="preserve">, ramo, script 39 non eseguito): chiusura solo dal giorno dopo il termine e insieme alla fase 3; prima del termine solo per pratica annullata/ritirata/chiusa con motivazione; Borgoval non toccato</w:t>
+              <w:t xml:space="preserve">; in produzione il 22/10 alle 14:30, script 39): chiusura solo dal giorno dopo il termine e insieme alla fase 3; prima del termine solo per pratica annullata/ritirata/chiusa con motivazione; Borgoval non toccato</w:t>
             </w:r>
           </w:p>
         </w:tc>
@@ -15912,7 +16009,7 @@
                 <w:sz w:val="18"/>
                 <w:szCs w:val="18"/>
               </w:rPr>
-              <w:t xml:space="preserve">, ramo, script 39): fase 5 solo con un ente attivo assegnato; ente non rimovibile a fase 5 aperta; dato di Borgoval da decidere a parte</w:t>
+              <w:t xml:space="preserve">; in produzione il 22/10, script 39): fase 5 solo con un ente attivo assegnato; ente non rimovibile a fase 5 aperta; dato di Borgoval da decidere a parte</w:t>
             </w:r>
           </w:p>
         </w:tc>
@@ -16106,7 +16203,7 @@
                 <w:sz w:val="18"/>
                 <w:szCs w:val="18"/>
               </w:rPr>
-              <w:t xml:space="preserve">, ramo): riquadro «Fase aperta senza scadenza»; causa delle date mancanti: fasi aperte il 17/10 con la scrittura diretta tolta il 18/10 (</w:t>
+              <w:t xml:space="preserve">; in produzione il 22/10): riquadro «Fase aperta senza scadenza»; causa delle date mancanti: fasi aperte il 17/10 con la scrittura diretta tolta il 18/10 (</w:t>
             </w:r>
             <w:r>
               <w:rPr>
@@ -16377,7 +16474,7 @@
                 <w:sz w:val="18"/>
                 <w:szCs w:val="18"/>
               </w:rPr>
-              <w:t xml:space="preserve">, ramo): solo avviso non bloccante per i codici scritti a mano fuori formato; due codici scritti a mano (il generatore produce sempre 4 cifre maiuscole); nessuna rinomina</w:t>
+              <w:t xml:space="preserve">; in produzione il 22/10): solo avviso non bloccante per i codici scritti a mano fuori formato; due codici scritti a mano (il generatore produce sempre 4 cifre maiuscole); nessuna rinomina</w:t>
             </w:r>
           </w:p>
         </w:tc>
@@ -16571,7 +16668,7 @@
                 <w:sz w:val="18"/>
                 <w:szCs w:val="18"/>
               </w:rPr>
-              <w:t xml:space="preserve">, ramo): solo trasparenza (quota, tonnellate, FE, frazioni oltre le cinque ed escluse) nei risultati e nel PDF; formula invariata</w:t>
+              <w:t xml:space="preserve">; in produzione il 22/10): solo trasparenza (quota, tonnellate, FE, frazioni oltre le cinque ed escluse) nei risultati e nel PDF; formula invariata</w:t>
             </w:r>
           </w:p>
         </w:tc>
@@ -17452,25 +17549,7 @@
           <w:sz w:val="21"/>
           <w:szCs w:val="21"/>
         </w:rPr>
-        <w:t xml:space="preserve">. Le correzioni sono sul ramo </w:t>
-      </w:r>
-      <w:r>
-        <w:rPr>
-          <w:rFonts w:ascii="Consolas" w:cs="Consolas" w:eastAsia="Consolas" w:hAnsi="Consolas"/>
-          <w:color w:val="2F5D3A"/>
-          <w:sz w:val="21"/>
-          <w:szCs w:val="21"/>
-        </w:rPr>
-        <w:t xml:space="preserve">correzioni-rilievi-n01-n06</w:t>
-      </w:r>
-      <w:r>
-        <w:rPr>
-          <w:rFonts w:ascii="Arial" w:cs="Arial" w:eastAsia="Arial" w:hAnsi="Arial"/>
-          <w:color w:val="1B2118"/>
-          <w:sz w:val="21"/>
-          <w:szCs w:val="21"/>
-        </w:rPr>
-        <w:t xml:space="preserve">, non in produzione. Lo script 39 si esegue solo con l'OK di Luca e il mandato del collaudo. Nessun dato storico è stato modificato; gli interventi sui dati (Borgoval, scadenze mancanti, codici) sono proposti a parte. Conseguenza per il collaudo: il percorso di prova non chiude più il feedback il giorno stesso (Manuale di test, nota dopo la prova 4.9d).</w:t>
+        <w:t xml:space="preserve">. Le correzioni sono in produzione dal 22/10/2026 alle 14:30 (script 39 eseguito con l'OK di Luca). Nessun dato storico è stato modificato; gli interventi sui dati (Borgoval, scadenze mancanti, codici) sono proposti a parte. Conseguenza per il collaudo: il percorso di prova non chiude più il feedback il giorno stesso (Manuale di test, nota dopo la prova 4.9d).</w:t>
       </w:r>
     </w:p>
     <w:p>
@@ -20736,25 +20815,7 @@
           <w:sz w:val="21"/>
           <w:szCs w:val="21"/>
         </w:rPr>
-        <w:t xml:space="preserve"> D01-D07, R05, R07 (Manuale di test 7.17-7.22, 8b.5-8b.5e, 8b.9b), D05-R1, O01 (10.5, 10.5b) e ISS-035 (8b.7, 8b.7b). Dopo il rilascio del ramo </w:t>
-      </w:r>
-      <w:r>
-        <w:rPr>
-          <w:rFonts w:ascii="Consolas" w:cs="Consolas" w:eastAsia="Consolas" w:hAnsi="Consolas"/>
-          <w:color w:val="2F5D3A"/>
-          <w:sz w:val="21"/>
-          <w:szCs w:val="21"/>
-        </w:rPr>
-        <w:t xml:space="preserve">correzioni-rilievi-n01-n06</w:t>
-      </w:r>
-      <w:r>
-        <w:rPr>
-          <w:rFonts w:ascii="Arial" w:cs="Arial" w:eastAsia="Arial" w:hAnsi="Arial"/>
-          <w:color w:val="1B2118"/>
-          <w:sz w:val="21"/>
-          <w:szCs w:val="21"/>
-        </w:rPr>
-        <w:t xml:space="preserve">: N01 (8b.7d, 8b.7f), N02 (4.1, 4.9-4.9d), N03 (5.0, 5.1c), N04 (10.10f), N05 (1.2d), N06 (7.24).</w:t>
+        <w:t xml:space="preserve"> D01-D07, R05, R07 (Manuale di test 7.17-7.22, 8b.5-8b.5e, 8b.9b), D05-R1, O01 (10.5, 10.5b) e ISS-035 (8b.7, 8b.7b). In produzione dal 22/10: N01 (8b.7d, 8b.7f), N02 (4.1, 4.9-4.9d), N03 (5.0, 5.1c), N04 (10.10f), N05 (1.2d), N06 (7.24).</w:t>
       </w:r>
     </w:p>
     <w:p>
@@ -21885,6 +21946,77 @@
                 <w:szCs w:val="18"/>
               </w:rPr>
               <w:t xml:space="preserve">ISS-038: navigazione da smartphone</w:t>
+            </w:r>
+          </w:p>
+        </w:tc>
+      </w:tr>
+      <w:tr>
+        <w:trPr>
+          <w:cantSplit/>
+        </w:trPr>
+        <w:tc>
+          <w:tcPr>
+            <w:tcW w:type="dxa" w:w="2029"/>
+            <w:tcBorders>
+              <w:top w:val="single" w:color="D9D4C5" w:sz="4"/>
+              <w:left w:val="single" w:color="D9D4C5" w:sz="4"/>
+              <w:bottom w:val="single" w:color="D9D4C5" w:sz="4"/>
+              <w:right w:val="single" w:color="D9D4C5" w:sz="4"/>
+            </w:tcBorders>
+            <w:shd w:fill="F6F4EE" w:color="auto" w:val="clear"/>
+            <w:tcMar>
+              <w:top w:type="dxa" w:w="70"/>
+              <w:left w:type="dxa" w:w="110"/>
+              <w:bottom w:type="dxa" w:w="70"/>
+              <w:right w:type="dxa" w:w="110"/>
+            </w:tcMar>
+            <w:vAlign w:val="center"/>
+          </w:tcPr>
+          <w:p>
+            <w:pPr>
+              <w:spacing w:after="0" w:before="0"/>
+            </w:pPr>
+            <w:r>
+              <w:rPr>
+                <w:rFonts w:ascii="Arial" w:cs="Arial" w:eastAsia="Arial" w:hAnsi="Arial"/>
+                <w:color w:val="1B2118"/>
+                <w:sz w:val="18"/>
+                <w:szCs w:val="18"/>
+              </w:rPr>
+              <w:t xml:space="preserve">22/10/2026 14:50</w:t>
+            </w:r>
+          </w:p>
+        </w:tc>
+        <w:tc>
+          <w:tcPr>
+            <w:tcW w:type="dxa" w:w="7609"/>
+            <w:tcBorders>
+              <w:top w:val="single" w:color="D9D4C5" w:sz="4"/>
+              <w:left w:val="single" w:color="D9D4C5" w:sz="4"/>
+              <w:bottom w:val="single" w:color="D9D4C5" w:sz="4"/>
+              <w:right w:val="single" w:color="D9D4C5" w:sz="4"/>
+            </w:tcBorders>
+            <w:shd w:fill="F6F4EE" w:color="auto" w:val="clear"/>
+            <w:tcMar>
+              <w:top w:type="dxa" w:w="70"/>
+              <w:left w:type="dxa" w:w="110"/>
+              <w:bottom w:type="dxa" w:w="70"/>
+              <w:right w:type="dxa" w:w="110"/>
+            </w:tcMar>
+            <w:vAlign w:val="center"/>
+          </w:tcPr>
+          <w:p>
+            <w:pPr>
+              <w:spacing w:after="0" w:before="0"/>
+            </w:pPr>
+            <w:r>
+              <w:rPr>
+                <w:rFonts w:ascii="Arial" w:cs="Arial" w:eastAsia="Arial" w:hAnsi="Arial"/>
+                <w:color w:val="1B2118"/>
+                <w:sz w:val="18"/>
+                <w:szCs w:val="18"/>
+              </w:rPr>
+              <w:t xml:space="preserve">Rilascio in produzione di N01-N04, ISS-038 e script 38-39</w:t>
             </w:r>
           </w:p>
         </w:tc>
@@ -22130,7 +22262,7 @@
         <w:szCs w:val="16"/>
       </w:rPr>
       <w:tab/>
-      <w:t xml:space="preserve">Registro issue e test · Rev. 1.9 · 22/10/2026</w:t>
+      <w:t xml:space="preserve">Registro issue e test · Rev. 1.10 · 22/10/2026</w:t>
     </w:r>
   </w:p>
 </w:hdr>
@@ -22195,7 +22327,7 @@
         <w:szCs w:val="16"/>
       </w:rPr>
       <w:tab/>
-      <w:t xml:space="preserve">Registro issue e test · Rev. 1.9 · 22/10/2026</w:t>
+      <w:t xml:space="preserve">Registro issue e test · Rev. 1.10 · 22/10/2026</w:t>
     </w:r>
   </w:p>
 </w:hdr>

</xml_diff>